<commit_message>
feat: tạo file cấu hình, update trang Cộng đồng
</commit_message>
<xml_diff>
--- a/Bai_Bao_Khoa_Hoc_FAME_KT.docx
+++ b/Bai_Bao_Khoa_Hoc_FAME_KT.docx
@@ -13,48 +13,6 @@
           <w:sz w:val="30"/>
         </w:rPr>
         <w:t>Mô hình đánh giá năng lực thích ứng đa chiều FAME-KT: Tích hợp yếu tố đoán mò và tâm lý trắc lượng thời gian trong bài kiểm tra đầu vào trực tuyến</w:t>
-      </w:r>
-    </w:p>
-    <w:p>
-      <w:pPr>
-        <w:spacing w:after="320"/>
-        <w:jc w:val="center"/>
-      </w:pPr>
-      <w:r>
-        <w:rPr>
-          <w:i/>
-          <w:color w:val="475569"/>
-          <w:sz w:val="22"/>
-        </w:rPr>
-        <w:t>FAME-KT: A time-weighted and multi-dimensional Elo-based adaptive placement testing model with 3PL guessing for online language learning</w:t>
-      </w:r>
-    </w:p>
-    <w:p>
-      <w:pPr>
-        <w:spacing w:after="360"/>
-        <w:jc w:val="center"/>
-      </w:pPr>
-      <w:r>
-        <w:rPr>
-          <w:b/>
-          <w:sz w:val="22"/>
-        </w:rPr>
-        <w:br/>
-      </w:r>
-      <w:r>
-        <w:rPr>
-          <w:color w:val="475569"/>
-          <w:sz w:val="20"/>
-        </w:rPr>
-        <w:t>Khoa Công nghệ Thông tin – Trường Đại học Sư phạm Kỹ thuật TP.HCM</w:t>
-      </w:r>
-      <w:r>
-        <w:rPr>
-          <w:color w:val="475569"/>
-          <w:sz w:val="20"/>
-        </w:rPr>
-        <w:br/>
-        <w:t>Email: daothanhtrong42005@gmail.com</w:t>
       </w:r>
     </w:p>
     <w:p>
@@ -111,14 +69,7 @@
         <w:rPr>
           <w:sz w:val="21"/>
         </w:rPr>
-        <w:t xml:space="preserve">In online language learning platforms, initial placement testing is critical for tailoring adaptive learning paths. However, existing computerized adaptive testing frameworks face significant limitations: conventional item response theory models demand large pre-calibration datasets leading to cold-start barriers, whereas standard Elo rating systems overlook the 25% random guessing factor inherent in four-option multiple-choice questions, neglect response time dynamics, and remain strictly unidimensional. This paper proposes FAME-KT, a lightweight hybrid framework that addresses these issues. FAME-KT incorporates the 3PL guessing parameter into the Elo expected score function, applies a psychometric response-time weighting mechanism to penalize rapid guessing, tracks competence across a four-dimensional vector covering grammar, vocabulary, listening, and reading, and uses a sliding-window convergence criterion for dynamic early stopping. Empirical evaluations on the EdNet </w:t>
-      </w:r>
-      <w:r>
-        <w:rPr>
-          <w:sz w:val="21"/>
-        </w:rPr>
-        <w:lastRenderedPageBreak/>
-        <w:t>benchmark dataset with over 130 million interactions show that FAME-KT reduces test length by 50.7%, averaging 7.4 items compared to 15 fixed items, while achieving a low RMSE of 0.084 and effectively eliminating score distortion caused by guessing. The model is fully implemented and running stably in a production mobile English learning application.</w:t>
+        <w:t>In online language learning platforms, initial placement testing is critical for tailoring adaptive learning paths. However, existing computerized adaptive testing frameworks face significant limitations: conventional item response theory models demand large pre-calibration datasets leading to cold-start barriers, whereas standard Elo rating systems overlook the 25% random guessing factor inherent in four-option multiple-choice questions, neglect response time dynamics, and remain strictly unidimensional. This paper proposes FAME-KT, a lightweight hybrid framework that addresses these issues. FAME-KT incorporates the 3PL guessing parameter into the Elo expected score function, applies a psychometric response-time weighting mechanism to penalize rapid guessing, tracks competence across a four-dimensional vector covering grammar, vocabulary, listening, and reading, and uses a sliding-window convergence criterion for dynamic early stopping. Empirical evaluations on the EdNet benchmark dataset with over 130 million interactions show that FAME-KT reduces test length by 50.7%, averaging 7.4 items compared to 15 fixed items, while achieving a low RMSE of 0.084 and effectively eliminating score distortion caused by guessing. The model is fully implemented and running stably in a production mobile English learning application.</w:t>
       </w:r>
     </w:p>
     <w:p>
@@ -148,6 +99,7 @@
         <w:rPr>
           <w:color w:val="CBD5E1"/>
         </w:rPr>
+        <w:lastRenderedPageBreak/>
         <w:t>———————————————————————————————————————————————————————</w:t>
       </w:r>
     </w:p>
@@ -216,11 +168,7 @@
         <w:jc w:val="both"/>
       </w:pPr>
       <w:r>
-        <w:t xml:space="preserve">Thứ ba, hầu hết các hệ thống hiện nay chỉ ghi nhận kết quả đúng hay sai mà không tính đến thời gian phản xạ. Theo nghiên cứu tâm lý học của Schnipke và Scrams [7], câu trả lời đúng chỉ trong hơn 1 giây cho một đoạn văn dài thực chất là hành vi đoán bừa tốc độ cao, trong khi câu trả lời </w:t>
-      </w:r>
-      <w:r>
-        <w:lastRenderedPageBreak/>
-        <w:t>mất nhiều thời gian lại thể hiện sự lưỡng lự hoặc tra cứu. Việc bỏ qua biến số thời gian khiến hệ thống mất đi một tín hiệu quan trọng phản ánh mức độ thành thạo thực chất.</w:t>
+        <w:t>Thứ ba, hầu hết các hệ thống hiện nay chỉ ghi nhận kết quả đúng hay sai mà không tính đến thời gian phản xạ. Theo nghiên cứu tâm lý học của Schnipke và Scrams [7], câu trả lời đúng chỉ trong hơn 1 giây cho một đoạn văn dài thực chất là hành vi đoán bừa tốc độ cao, trong khi câu trả lời mất nhiều thời gian lại thể hiện sự lưỡng lự hoặc tra cứu. Việc bỏ qua biến số thời gian khiến hệ thống mất đi một tín hiệu quan trọng phản ánh mức độ thành thạo thực chất.</w:t>
       </w:r>
     </w:p>
     <w:p>
@@ -237,6 +185,9 @@
       </w:r>
       <w:r>
         <w:br/>
+      </w:r>
+      <w:r>
+        <w:lastRenderedPageBreak/>
         <w:t>2. Thiết lập hàm trọng số thời gian phản xạ dựa trên tâm lý trắc lượng học để phân biệt hành vi bấm bừa và trạng thái làm bài tập trung.</w:t>
       </w:r>
       <w:r>
@@ -479,6 +430,7 @@
         <w:rPr>
           <w:b/>
         </w:rPr>
+        <w:lastRenderedPageBreak/>
         <w:t>2.3. Các mô hình truy vết tri thức BKT và DKT</w:t>
       </w:r>
     </w:p>
@@ -1615,7 +1567,6 @@
               <w:rPr>
                 <w:sz w:val="19"/>
               </w:rPr>
-              <w:lastRenderedPageBreak/>
               <w:t>Khả năng chạy trên di động</w:t>
             </w:r>
           </w:p>
@@ -1758,6 +1709,7 @@
           <w:color w:val="1E3A8A"/>
           <w:sz w:val="26"/>
         </w:rPr>
+        <w:lastRenderedPageBreak/>
         <w:t>3. Phương pháp đề xuất: mô hình FAME-KT</w:t>
       </w:r>
     </w:p>
@@ -2023,15 +1975,15 @@
       </w:r>
       <w:r>
         <w:br/>
-        <w:t xml:space="preserve">• Vùng dưới 2 giây: Thời gian này ngắn hơn ngưỡng sinh lý cần thiết để đọc hiểu câu hỏi tiếng </w:t>
+        <w:t>• Vùng dưới 2 giây: Thời gian này ngắn hơn ngưỡng sinh lý cần thiết để đọc hiểu câu hỏi tiếng Anh, phản ánh hành vi chọn bừa. Hệ số T_f = 0,2 giúp triệt tiêu phần lớn điểm thưởng nếu câu trả lời tình cờ đúng.</w:t>
+      </w:r>
+      <w:r>
+        <w:br/>
+        <w:t xml:space="preserve">• Vùng từ 2 đến 15 giây: Đây là khoảng thời gian tối ưu khi người học nhận diện nhanh cấu trúc </w:t>
       </w:r>
       <w:r>
         <w:lastRenderedPageBreak/>
-        <w:t>Anh, phản ánh hành vi chọn bừa. Hệ số T_f = 0,2 giúp triệt tiêu phần lớn điểm thưởng nếu câu trả lời tình cờ đúng.</w:t>
-      </w:r>
-      <w:r>
-        <w:br/>
-        <w:t>• Vùng từ 2 đến 15 giây: Đây là khoảng thời gian tối ưu khi người học nhận diện nhanh cấu trúc câu và từ vựng, thể hiện sự thành thạo. Hệ số thưởng T_f = 1,5 giúp rút ngắn quá trình xác định trình độ.</w:t>
+        <w:t>câu và từ vựng, thể hiện sự thành thạo. Hệ số thưởng T_f = 1,5 giúp rút ngắn quá trình xác định trình độ.</w:t>
       </w:r>
       <w:r>
         <w:br/>
@@ -2287,7 +2239,6 @@
                 <w:color w:val="1E3A8A"/>
                 <w:sz w:val="21"/>
               </w:rPr>
-              <w:lastRenderedPageBreak/>
               <w:t>Công thức 7: Điều kiện dừng sớm dựa trên cửa sổ trượt hội tụ</w:t>
             </w:r>
             <w:r>
@@ -2512,9 +2463,6 @@
       </w:r>
       <w:r>
         <w:br/>
-      </w:r>
-      <w:r>
-        <w:lastRenderedPageBreak/>
         <w:t>• Số câu trung bình: Số lượng câu hỏi học viên cần trả lời trước khi bài thi kết thúc.</w:t>
       </w:r>
       <w:r>
@@ -2527,6 +2475,9 @@
       </w:r>
       <w:r>
         <w:br/>
+      </w:r>
+      <w:r>
+        <w:lastRenderedPageBreak/>
         <w:t>• Độ lệch do đoán mò: Mức độ sai lệch điểm số khi đưa vào 20% câu trả lời ngẫu nhiên với thời gian dưới 2 giây.</w:t>
       </w:r>
     </w:p>
@@ -3693,7 +3644,6 @@
               <w:rPr>
                 <w:sz w:val="19"/>
               </w:rPr>
-              <w:lastRenderedPageBreak/>
               <w:t>FAME-KT đầy đủ</w:t>
             </w:r>
           </w:p>
@@ -3942,6 +3892,7 @@
               <w:rPr>
                 <w:sz w:val="19"/>
               </w:rPr>
+              <w:lastRenderedPageBreak/>
               <w:t>Bỏ tham số đoán mò</w:t>
             </w:r>
           </w:p>
@@ -4387,11 +4338,7 @@
         <w:jc w:val="both"/>
       </w:pPr>
       <w:r>
-        <w:t xml:space="preserve">Bài báo đã giới thiệu mô hình FAME-KT phục vụ việc kiểm tra năng lực đầu vào thích ứng trong các ứng dụng học tiếng Anh trực tuyến. Nhờ kết hợp hợp lý giữa lý thuyết phản ứng câu hỏi 3PL, tốc độ tính toán nhanh của Elo, nguyên lý thời gian phản xạ trong tâm lý trắc lượng học và quy tắc dừng sớm cửa sổ trượt, FAME-KT giải quyết hiệu quả các bài toán về khởi động lạnh, đoán mò ngẫu nhiên, mệt mỏi nhận thức và đánh giá kỹ năng đa chiều. Thực nghiệm trên bộ dữ </w:t>
-      </w:r>
-      <w:r>
-        <w:lastRenderedPageBreak/>
-        <w:t>liệu lớn EdNet đã chứng minh tính hiệu quả vượt trội của mô hình về cả độ chính xác học thuật lẫn khả năng ứng dụng thực tế.</w:t>
+        <w:t>Bài báo đã giới thiệu mô hình FAME-KT phục vụ việc kiểm tra năng lực đầu vào thích ứng trong các ứng dụng học tiếng Anh trực tuyến. Nhờ kết hợp hợp lý giữa lý thuyết phản ứng câu hỏi 3PL, tốc độ tính toán nhanh của Elo, nguyên lý thời gian phản xạ trong tâm lý trắc lượng học và quy tắc dừng sớm cửa sổ trượt, FAME-KT giải quyết hiệu quả các bài toán về khởi động lạnh, đoán mò ngẫu nhiên, mệt mỏi nhận thức và đánh giá kỹ năng đa chiều. Thực nghiệm trên bộ dữ liệu lớn EdNet đã chứng minh tính hiệu quả vượt trội của mô hình về cả độ chính xác học thuật lẫn khả năng ứng dụng thực tế.</w:t>
       </w:r>
     </w:p>
     <w:p>
@@ -4403,6 +4350,7 @@
         <w:rPr>
           <w:b/>
         </w:rPr>
+        <w:lastRenderedPageBreak/>
         <w:t>5.2. Hướng phát triển tiếp theo</w:t>
       </w:r>
     </w:p>

</xml_diff>